<commit_message>
Update UAT Documentation to remove Team ID and fix gap
</commit_message>
<xml_diff>
--- a/5. Project Deployment/User Acceptance Testing FSD.docx
+++ b/5. Project Deployment/User Acceptance Testing FSD.docx
@@ -154,7 +154,7 @@
                 <w:color w:val="000000"/>
                 <w:rtl w:val="0"/>
               </w:rPr>
-              <w:t xml:space="preserve">Project Name</w:t>
+              <w:t xml:space="preserve">Team ID</w:t>
             </w:r>
             <w:r>
               <w:rPr>
@@ -179,20 +179,7 @@
             </w:tcMar>
           </w:tcPr>
           <w:p>
-            <w:pPr>
-              <w:spacing w:after="0" w:line="240" w:lineRule="auto"/>
-              <w:rPr>
-                <w:rFonts w:ascii="Times New Roman" w:cs="Times New Roman" w:eastAsia="Times New Roman" w:hAnsi="Times New Roman"/>
-                <w:sz w:val="24"/>
-                <w:szCs w:val="24"/>
-              </w:rPr>
-            </w:pPr>
-            <w:r>
-              <w:rPr>
-                <w:rtl w:val="0"/>
-              </w:rPr>
-              <w:t>House Rent</w:t>
-            </w:r>
+            <w:r/>
           </w:p>
         </w:tc>
       </w:tr>
@@ -231,7 +218,7 @@
                 <w:color w:val="000000"/>
                 <w:rtl w:val="0"/>
               </w:rPr>
-              <w:t xml:space="preserve">Maximum Marks</w:t>
+              <w:t xml:space="preserve">Project Name</w:t>
             </w:r>
             <w:r>
               <w:rPr>
@@ -268,6 +255,83 @@
               <w:rPr>
                 <w:rtl w:val="0"/>
               </w:rPr>
+              <w:t>House Rent</w:t>
+            </w:r>
+          </w:p>
+        </w:tc>
+      </w:tr>
+      <w:tr>
+        <w:trPr>
+          <w:cantSplit w:val="0"/>
+          <w:tblHeader w:val="0"/>
+        </w:trPr>
+        <w:tc>
+          <w:tcPr>
+            <w:tcBorders>
+              <w:top w:color="000000" w:space="0" w:sz="4" w:val="single"/>
+              <w:left w:color="000000" w:space="0" w:sz="4" w:val="single"/>
+              <w:bottom w:color="000000" w:space="0" w:sz="4" w:val="single"/>
+              <w:right w:color="000000" w:space="0" w:sz="4" w:val="single"/>
+            </w:tcBorders>
+            <w:tcMar>
+              <w:top w:w="0.0" w:type="dxa"/>
+              <w:left w:w="108.0" w:type="dxa"/>
+              <w:bottom w:w="0.0" w:type="dxa"/>
+              <w:right w:w="108.0" w:type="dxa"/>
+            </w:tcMar>
+          </w:tcPr>
+          <w:p>
+            <w:pPr>
+              <w:spacing w:after="0" w:line="240" w:lineRule="auto"/>
+              <w:rPr>
+                <w:rFonts w:ascii="Times New Roman" w:cs="Times New Roman" w:eastAsia="Times New Roman" w:hAnsi="Times New Roman"/>
+                <w:sz w:val="24"/>
+                <w:szCs w:val="24"/>
+              </w:rPr>
+            </w:pPr>
+            <w:r>
+              <w:rPr>
+                <w:rFonts w:ascii="Calibri" w:cs="Calibri" w:eastAsia="Calibri" w:hAnsi="Calibri"/>
+                <w:color w:val="000000"/>
+                <w:rtl w:val="0"/>
+              </w:rPr>
+              <w:t xml:space="preserve">Maximum Marks</w:t>
+            </w:r>
+            <w:r>
+              <w:rPr>
+                <w:rtl w:val="0"/>
+              </w:rPr>
+            </w:r>
+          </w:p>
+        </w:tc>
+        <w:tc>
+          <w:tcPr>
+            <w:tcBorders>
+              <w:top w:color="000000" w:space="0" w:sz="4" w:val="single"/>
+              <w:left w:color="000000" w:space="0" w:sz="4" w:val="single"/>
+              <w:bottom w:color="000000" w:space="0" w:sz="4" w:val="single"/>
+              <w:right w:color="000000" w:space="0" w:sz="4" w:val="single"/>
+            </w:tcBorders>
+            <w:tcMar>
+              <w:top w:w="0.0" w:type="dxa"/>
+              <w:left w:w="108.0" w:type="dxa"/>
+              <w:bottom w:w="0.0" w:type="dxa"/>
+              <w:right w:w="108.0" w:type="dxa"/>
+            </w:tcMar>
+          </w:tcPr>
+          <w:p>
+            <w:pPr>
+              <w:spacing w:after="0" w:line="240" w:lineRule="auto"/>
+              <w:rPr>
+                <w:rFonts w:ascii="Times New Roman" w:cs="Times New Roman" w:eastAsia="Times New Roman" w:hAnsi="Times New Roman"/>
+                <w:sz w:val="24"/>
+                <w:szCs w:val="24"/>
+              </w:rPr>
+            </w:pPr>
+            <w:r>
+              <w:rPr>
+                <w:rtl w:val="0"/>
+              </w:rPr>
               <w:t>100</w:t>
             </w:r>
           </w:p>
@@ -309,7 +373,7 @@
         <w:rPr>
           <w:rtl w:val="0"/>
         </w:rPr>
-        <w:t>Project Description: A full-stack MERN web application that connects property owners with potential renters. Owners can list properties, manage bookings, and approve or reject renter requests. Renters can browse listings, book properties, and track their booking status in real time.</w:t>
+        <w:t>Project Description: A full-stack MERN web application that connects property owners with potential renters. Owners can list properties, manage bookings, and approve/reject renter requests. Renters can browse listings, book properties, and track their booking status in real-time.</w:t>
       </w:r>
     </w:p>
     <w:p>
@@ -362,7 +426,7 @@
         <w:br/>
         <w:t>• Property Listing – Add, Edit, Delete by Owner</w:t>
         <w:br/>
-        <w:t>• Property Search &amp; Filter by Location, Price, and Type</w:t>
+        <w:t>• Property Search &amp; Filter by Location, Price, Type</w:t>
         <w:br/>
         <w:t>• Property Booking by Renter</w:t>
         <w:br/>
@@ -370,7 +434,7 @@
         <w:br/>
         <w:t>• Booking Status Tracking by Renter</w:t>
         <w:br/>
-        <w:t>• Owner Dashboard – View and Manage All Bookings</w:t>
+        <w:t>• Owner Dashboard – View All Bookings</w:t>
         <w:br/>
         <w:t>• Renter Dashboard – View My Bookings</w:t>
         <w:br/>
@@ -395,7 +459,7 @@
         <w:br/>
         <w:t>• As a Renter, I can view the real-time status of my bookings.</w:t>
         <w:br/>
-        <w:t>• As an Owner, I can ensure only one renter is approved per property per date slot.</w:t>
+        <w:t>• As an Admin/Owner, I can ensure only one renter is approved per property per date.</w:t>
       </w:r>
     </w:p>
     <w:p>
@@ -433,7 +497,7 @@
         <w:rPr>
           <w:rtl w:val="0"/>
         </w:rPr>
-        <w:t>Credentials (if required): Renter – renter@test.com / Test@123  |  Owner – owner@test.com / Test@123</w:t>
+        <w:t>Credentials (if required): Renter – renter@test.com / Test@123 | Owner – owner@test.com / Test@123</w:t>
       </w:r>
     </w:p>
     <w:p>
@@ -655,9 +719,9 @@
             <w:r>
               <w:t>1. Navigate to /register</w:t>
               <w:br/>
-              <w:t>2. Fill name, email, password, role</w:t>
-              <w:br/>
-              <w:t>3. Click Register</w:t>
+              <w:t>2. Fill in name, email, password, and role (Renter/Owner)</w:t>
+              <w:br/>
+              <w:t>3. Click "Register"</w:t>
             </w:r>
           </w:p>
         </w:tc>
@@ -667,7 +731,7 @@
           </w:tcPr>
           <w:p>
             <w:r>
-              <w:t>Account created; redirected to dashboard</w:t>
+              <w:t>User account is created and redirected to dashboard</w:t>
             </w:r>
           </w:p>
         </w:tc>
@@ -677,7 +741,7 @@
           </w:tcPr>
           <w:p>
             <w:r>
-              <w:t>Account created; redirected to correct dashboard</w:t>
+              <w:t>User account created successfully; redirected to dashboard</w:t>
             </w:r>
           </w:p>
         </w:tc>
@@ -721,9 +785,9 @@
             <w:r>
               <w:t>1. Navigate to /login</w:t>
               <w:br/>
-              <w:t>2. Enter valid email &amp; password</w:t>
-              <w:br/>
-              <w:t>3. Click Login</w:t>
+              <w:t>2. Enter valid email and password</w:t>
+              <w:br/>
+              <w:t>3. Click "Login"</w:t>
             </w:r>
           </w:p>
         </w:tc>
@@ -733,7 +797,7 @@
           </w:tcPr>
           <w:p>
             <w:r>
-              <w:t>User authenticated; role-based dashboard shown</w:t>
+              <w:t>User is authenticated and redirected to their role-based dashboard</w:t>
             </w:r>
           </w:p>
         </w:tc>
@@ -743,7 +807,7 @@
           </w:tcPr>
           <w:p>
             <w:r>
-              <w:t>Login successful; correct dashboard displayed</w:t>
+              <w:t>Login successful; correct dashboard displayed based on role</w:t>
             </w:r>
           </w:p>
         </w:tc>
@@ -775,7 +839,7 @@
           </w:tcPr>
           <w:p>
             <w:r>
-              <w:t>Owner Adds Property Listing</w:t>
+              <w:t>Owner adds a Property Listing</w:t>
             </w:r>
           </w:p>
         </w:tc>
@@ -787,11 +851,13 @@
             <w:r>
               <w:t>1. Login as Owner</w:t>
               <w:br/>
-              <w:t>2. Click Add Property</w:t>
-              <w:br/>
-              <w:t>3. Fill details &amp; upload images</w:t>
-              <w:br/>
-              <w:t>4. Submit</w:t>
+              <w:t>2. Click "Add Property"</w:t>
+              <w:br/>
+              <w:t>3. Fill in title, description, price, location, type</w:t>
+              <w:br/>
+              <w:t>4. Upload property images</w:t>
+              <w:br/>
+              <w:t>5. Click "Submit"</w:t>
             </w:r>
           </w:p>
         </w:tc>
@@ -801,7 +867,7 @@
           </w:tcPr>
           <w:p>
             <w:r>
-              <w:t>Property listed; visible to renters in search</w:t>
+              <w:t>Property is listed and visible to renters on search page</w:t>
             </w:r>
           </w:p>
         </w:tc>
@@ -811,7 +877,7 @@
           </w:tcPr>
           <w:p>
             <w:r>
-              <w:t>Property listed and appeared in search results</w:t>
+              <w:t>Property listed successfully and appeared in search results</w:t>
             </w:r>
           </w:p>
         </w:tc>
@@ -855,11 +921,11 @@
             <w:r>
               <w:t>1. Login as Renter</w:t>
               <w:br/>
-              <w:t>2. Enter location</w:t>
-              <w:br/>
-              <w:t>3. Apply price &amp; type filters</w:t>
-              <w:br/>
-              <w:t>4. Search</w:t>
+              <w:t>2. Enter location in search bar</w:t>
+              <w:br/>
+              <w:t>3. Apply price range and property type filters</w:t>
+              <w:br/>
+              <w:t>4. Click "Search"</w:t>
             </w:r>
           </w:p>
         </w:tc>
@@ -869,7 +935,7 @@
           </w:tcPr>
           <w:p>
             <w:r>
-              <w:t>Filtered list of matching properties displayed</w:t>
+              <w:t>Filtered list of properties matching the criteria is displayed</w:t>
             </w:r>
           </w:p>
         </w:tc>
@@ -879,7 +945,7 @@
           </w:tcPr>
           <w:p>
             <w:r>
-              <w:t>Correct filtered results returned</w:t>
+              <w:t>Correct filtered results returned based on input criteria</w:t>
             </w:r>
           </w:p>
         </w:tc>
@@ -923,11 +989,11 @@
             <w:r>
               <w:t>1. Login as Renter</w:t>
               <w:br/>
-              <w:t>2. Open a listing</w:t>
-              <w:br/>
-              <w:t>3. Select dates</w:t>
-              <w:br/>
-              <w:t>4. Click Book Now</w:t>
+              <w:t>2. Open a property listing</w:t>
+              <w:br/>
+              <w:t>3. Select check-in and check-out dates</w:t>
+              <w:br/>
+              <w:t>4. Click "Book Now"</w:t>
             </w:r>
           </w:p>
         </w:tc>
@@ -937,7 +1003,7 @@
           </w:tcPr>
           <w:p>
             <w:r>
-              <w:t>Booking submitted with Pending status</w:t>
+              <w:t>Booking request is submitted with "Pending" status</w:t>
             </w:r>
           </w:p>
         </w:tc>
@@ -947,7 +1013,7 @@
           </w:tcPr>
           <w:p>
             <w:r>
-              <w:t>Booking submitted; status shown as Pending</w:t>
+              <w:t>Booking submitted; status shown as Pending in Renter dashboard</w:t>
             </w:r>
           </w:p>
         </w:tc>
@@ -979,7 +1045,7 @@
           </w:tcPr>
           <w:p>
             <w:r>
-              <w:t>Owner Approves Booking</w:t>
+              <w:t>Owner Views &amp; Approves Booking</w:t>
             </w:r>
           </w:p>
         </w:tc>
@@ -991,11 +1057,11 @@
             <w:r>
               <w:t>1. Login as Owner</w:t>
               <w:br/>
-              <w:t>2. Go to Bookings</w:t>
-              <w:br/>
-              <w:t>3. Select pending booking</w:t>
-              <w:br/>
-              <w:t>4. Click Approve</w:t>
+              <w:t>2. Go to Owner Dashboard → Bookings</w:t>
+              <w:br/>
+              <w:t>3. Select a pending booking</w:t>
+              <w:br/>
+              <w:t>4. Click "Approve"</w:t>
             </w:r>
           </w:p>
         </w:tc>
@@ -1005,7 +1071,7 @@
           </w:tcPr>
           <w:p>
             <w:r>
-              <w:t>Booking status changes to Approved</w:t>
+              <w:t>Booking status changes to "Approved"; renter notified</w:t>
             </w:r>
           </w:p>
         </w:tc>
@@ -1015,7 +1081,7 @@
           </w:tcPr>
           <w:p>
             <w:r>
-              <w:t>Status updated to Approved; visible in Renter dashboard</w:t>
+              <w:t>Booking status updated to Approved; visible in Renter dashboard</w:t>
             </w:r>
           </w:p>
         </w:tc>
@@ -1047,7 +1113,7 @@
           </w:tcPr>
           <w:p>
             <w:r>
-              <w:t>Owner Rejects Booking</w:t>
+              <w:t>Owner Rejects a Booking</w:t>
             </w:r>
           </w:p>
         </w:tc>
@@ -1059,11 +1125,11 @@
             <w:r>
               <w:t>1. Login as Owner</w:t>
               <w:br/>
-              <w:t>2. Go to Bookings</w:t>
-              <w:br/>
-              <w:t>3. Select pending booking</w:t>
-              <w:br/>
-              <w:t>4. Click Reject</w:t>
+              <w:t>2. Go to Owner Dashboard → Bookings</w:t>
+              <w:br/>
+              <w:t>3. Select a pending booking</w:t>
+              <w:br/>
+              <w:t>4. Click "Reject"</w:t>
             </w:r>
           </w:p>
         </w:tc>
@@ -1073,7 +1139,7 @@
           </w:tcPr>
           <w:p>
             <w:r>
-              <w:t>Booking status changes to Rejected</w:t>
+              <w:t>Booking status changes to "Rejected"</w:t>
             </w:r>
           </w:p>
         </w:tc>
@@ -1083,7 +1149,7 @@
           </w:tcPr>
           <w:p>
             <w:r>
-              <w:t>Booking rejected; status updated correctly</w:t>
+              <w:t>Booking rejected and status updated correctly in both dashboards</w:t>
             </w:r>
           </w:p>
         </w:tc>
@@ -1127,9 +1193,9 @@
             <w:r>
               <w:t>1. Login as Renter</w:t>
               <w:br/>
-              <w:t>2. Go to My Bookings</w:t>
-              <w:br/>
-              <w:t>3. Check statuses</w:t>
+              <w:t>2. Go to "My Bookings"</w:t>
+              <w:br/>
+              <w:t>3. Check the status of submitted bookings</w:t>
             </w:r>
           </w:p>
         </w:tc>
@@ -1139,7 +1205,7 @@
           </w:tcPr>
           <w:p>
             <w:r>
-              <w:t>All bookings shown with correct status</w:t>
+              <w:t>All bookings displayed with correct status (Pending/Approved/Rejected)</w:t>
             </w:r>
           </w:p>
         </w:tc>
@@ -1149,7 +1215,7 @@
           </w:tcPr>
           <w:p>
             <w:r>
-              <w:t>Booking statuses displayed accurately</w:t>
+              <w:t>Booking statuses displayed accurately and updated in real time</w:t>
             </w:r>
           </w:p>
         </w:tc>
@@ -1181,7 +1247,7 @@
           </w:tcPr>
           <w:p>
             <w:r>
-              <w:t>Owner Edits Property</w:t>
+              <w:t>Owner Edits a Property Listing</w:t>
             </w:r>
           </w:p>
         </w:tc>
@@ -1193,11 +1259,13 @@
             <w:r>
               <w:t>1. Login as Owner</w:t>
               <w:br/>
-              <w:t>2. Go to My Listings</w:t>
-              <w:br/>
-              <w:t>3. Edit property</w:t>
-              <w:br/>
-              <w:t>4. Update &amp; Save</w:t>
+              <w:t>2. Go to "My Listings"</w:t>
+              <w:br/>
+              <w:t>3. Click "Edit" on a property</w:t>
+              <w:br/>
+              <w:t>4. Update price and description</w:t>
+              <w:br/>
+              <w:t>5. Save changes</w:t>
             </w:r>
           </w:p>
         </w:tc>
@@ -1207,7 +1275,7 @@
           </w:tcPr>
           <w:p>
             <w:r>
-              <w:t>Property details updated immediately</w:t>
+              <w:t>Property details updated and reflected immediately on listing page</w:t>
             </w:r>
           </w:p>
         </w:tc>
@@ -1217,7 +1285,7 @@
           </w:tcPr>
           <w:p>
             <w:r>
-              <w:t>Property updated; changes visible to renters</w:t>
+              <w:t>Property updated successfully; changes visible to renters</w:t>
             </w:r>
           </w:p>
         </w:tc>
@@ -1249,7 +1317,7 @@
           </w:tcPr>
           <w:p>
             <w:r>
-              <w:t>Owner Deletes Property</w:t>
+              <w:t>Owner Deletes a Property Listing</w:t>
             </w:r>
           </w:p>
         </w:tc>
@@ -1261,11 +1329,11 @@
             <w:r>
               <w:t>1. Login as Owner</w:t>
               <w:br/>
-              <w:t>2. Go to My Listings</w:t>
-              <w:br/>
-              <w:t>3. Click Delete</w:t>
-              <w:br/>
-              <w:t>4. Confirm</w:t>
+              <w:t>2. Go to "My Listings"</w:t>
+              <w:br/>
+              <w:t>3. Click "Delete" on a property</w:t>
+              <w:br/>
+              <w:t>4. Confirm deletion</w:t>
             </w:r>
           </w:p>
         </w:tc>
@@ -1275,7 +1343,7 @@
           </w:tcPr>
           <w:p>
             <w:r>
-              <w:t>Property removed; no longer searchable</w:t>
+              <w:t>Property removed from listings; no longer searchable by renters</w:t>
             </w:r>
           </w:p>
         </w:tc>
@@ -1285,7 +1353,7 @@
           </w:tcPr>
           <w:p>
             <w:r>
-              <w:t>Property deleted; not in search results</w:t>
+              <w:t>Property deleted and no longer appears in search results</w:t>
             </w:r>
           </w:p>
         </w:tc>
@@ -1329,9 +1397,9 @@
             <w:r>
               <w:t>1. Login as Owner</w:t>
               <w:br/>
-              <w:t>2. Add/Edit property</w:t>
-              <w:br/>
-              <w:t>3. Upload images</w:t>
+              <w:t>2. Add or Edit a property</w:t>
+              <w:br/>
+              <w:t>3. Upload multiple images</w:t>
               <w:br/>
               <w:t>4. Save</w:t>
             </w:r>
@@ -1343,7 +1411,7 @@
           </w:tcPr>
           <w:p>
             <w:r>
-              <w:t>Images uploaded and shown on listing page</w:t>
+              <w:t>Images are uploaded and displayed on the property listing page</w:t>
             </w:r>
           </w:p>
         </w:tc>
@@ -1353,7 +1421,7 @@
           </w:tcPr>
           <w:p>
             <w:r>
-              <w:t>Images uploaded and rendered correctly</w:t>
+              <w:t>Images uploaded and rendered correctly on listing detail page</w:t>
             </w:r>
           </w:p>
         </w:tc>
@@ -1395,9 +1463,9 @@
           </w:tcPr>
           <w:p>
             <w:r>
-              <w:t>1. Open app on mobile or DevTools emulator</w:t>
-              <w:br/>
-              <w:t>2. Navigate Home, Listings, Dashboard</w:t>
+              <w:t>1. Open the application on a mobile device (or DevTools mobile emulator)</w:t>
+              <w:br/>
+              <w:t>2. Navigate through Home, Listings, and Dashboard pages</w:t>
             </w:r>
           </w:p>
         </w:tc>
@@ -1407,7 +1475,7 @@
           </w:tcPr>
           <w:p>
             <w:r>
-              <w:t>All pages render correctly on small screens</w:t>
+              <w:t>All pages render correctly on small screens with proper layout</w:t>
             </w:r>
           </w:p>
         </w:tc>
@@ -1417,7 +1485,7 @@
           </w:tcPr>
           <w:p>
             <w:r>
-              <w:t>UI adapts correctly; navigation and forms usable</w:t>
+              <w:t>UI adapts correctly to mobile screen; navigation and forms usable</w:t>
             </w:r>
           </w:p>
         </w:tc>
@@ -1461,9 +1529,9 @@
             <w:r>
               <w:t>1. Navigate to /login</w:t>
               <w:br/>
-              <w:t>2. Enter wrong email/password</w:t>
-              <w:br/>
-              <w:t>3. Click Login</w:t>
+              <w:t>2. Enter incorrect email and password</w:t>
+              <w:br/>
+              <w:t>3. Click "Login"</w:t>
             </w:r>
           </w:p>
         </w:tc>
@@ -1473,7 +1541,7 @@
           </w:tcPr>
           <w:p>
             <w:r>
-              <w:t>Error message shown; no access granted</w:t>
+              <w:t>Error message displayed; user not authenticated</w:t>
             </w:r>
           </w:p>
         </w:tc>
@@ -1483,7 +1551,7 @@
           </w:tcPr>
           <w:p>
             <w:r>
-              <w:t>Error shown; user not authenticated</w:t>
+              <w:t>Error "Invalid credentials" shown; no access granted</w:t>
             </w:r>
           </w:p>
         </w:tc>
@@ -1499,19 +1567,6 @@
         </w:tc>
       </w:tr>
     </w:tbl>
-    <w:p>
-      <w:pPr>
-        <w:rPr>
-          <w:b w:val="1"/>
-          <w:bCs w:val="1"/>
-        </w:rPr>
-      </w:pPr>
-      <w:r>
-        <w:rPr>
-          <w:rtl w:val="0"/>
-        </w:rPr>
-      </w:r>
-    </w:p>
     <w:p>
       <w:pPr>
         <w:rPr>
@@ -1730,15 +1785,15 @@
           </w:tcPr>
           <w:p>
             <w:r>
-              <w:t>1. Two renters book the same property for overlapping dates</w:t>
-              <w:br/>
-              <w:t>2. Owner sees two Pending requests in dashboard</w:t>
+              <w:t>1. Two renters (Renter A &amp; Renter B) both book the same property for overlapping dates</w:t>
+              <w:br/>
+              <w:t>2. Owner opens dashboard and sees two Pending requests</w:t>
               <w:br/>
               <w:t>3. Owner quickly approves Renter A</w:t>
               <w:br/>
-              <w:t>4. Before DB write commits, Owner also approves Renter B</w:t>
-              <w:br/>
-              <w:t>5. Both bookings end up Approved for same property &amp; dates</w:t>
+              <w:t>4. Before the database updates, Owner also approves Renter B</w:t>
+              <w:br/>
+              <w:t>5. Both bookings end up in "Approved" state for the same property and dates</w:t>
             </w:r>
           </w:p>
         </w:tc>
@@ -1768,7 +1823,7 @@
           </w:tcPr>
           <w:p>
             <w:r>
-              <w:t>Critical data-consistency bug. Backend lacks atomic locking on booking approval. Fix: use a DB transaction that checks for an existing Approved booking for the same property/date range before committing a second approval; auto-reject all other pending bookings once one is approved.</w:t>
+              <w:t>This is a critical data-consistency bug. The backend does not implement atomic locking or a "first-come-first-served" guard when approving bookings. Recommended fix: use a database transaction that checks if any other approved booking already exists for the same property and date range before committing the second approval. Alternatively, auto-reject all other pending bookings as soon as one is approved for the same slot.</w:t>
             </w:r>
           </w:p>
         </w:tc>
@@ -1800,11 +1855,11 @@
           </w:tcPr>
           <w:p>
             <w:r>
-              <w:t>1. Renter submits booking and stays on My Bookings page</w:t>
-              <w:br/>
-              <w:t>2. Owner approves from their dashboard</w:t>
-              <w:br/>
-              <w:t>3. Renter's page still shows Pending until manually refreshed</w:t>
+              <w:t>1. Renter submits a booking and stays on "My Bookings" page</w:t>
+              <w:br/>
+              <w:t>2. Owner approves the booking from their dashboard</w:t>
+              <w:br/>
+              <w:t>3. Renter's page still shows "Pending" status until manually refreshed</w:t>
             </w:r>
           </w:p>
         </w:tc>
@@ -1834,22 +1889,12 @@
           </w:tcPr>
           <w:p>
             <w:r>
-              <w:t>Renter dashboard lacks real-time updates. Recommend Socket.io or polling so renters see status changes without a manual reload.</w:t>
+              <w:t>The Renter dashboard does not use real-time updates (e.g., WebSocket or polling). A periodic polling mechanism or Socket.io integration is recommended so renters see status changes without a manual reload.</w:t>
             </w:r>
           </w:p>
         </w:tc>
       </w:tr>
     </w:tbl>
-    <w:p>
-      <w:pPr>
-        <w:rPr/>
-      </w:pPr>
-      <w:r>
-        <w:rPr>
-          <w:rtl w:val="0"/>
-        </w:rPr>
-      </w:r>
-    </w:p>
     <w:p>
       <w:pPr>
         <w:rPr>
@@ -1886,16 +1931,6 @@
           <w:rtl w:val="0"/>
         </w:rPr>
         <w:t>Date: July 9, 2026</w:t>
-      </w:r>
-    </w:p>
-    <w:p>
-      <w:pPr>
-        <w:rPr/>
-      </w:pPr>
-      <w:r>
-        <w:rPr>
-          <w:rtl w:val="0"/>
-        </w:rPr>
       </w:r>
     </w:p>
     <w:p>
@@ -2084,16 +2119,6 @@
           <w:rtl w:val="0"/>
         </w:rPr>
         <w:t xml:space="preserve">Obtain sign-off from both the project manager and product owner before proceeding with deployment.</w:t>
-      </w:r>
-    </w:p>
-    <w:p>
-      <w:pPr>
-        <w:rPr/>
-      </w:pPr>
-      <w:r>
-        <w:rPr>
-          <w:rtl w:val="0"/>
-        </w:rPr>
       </w:r>
     </w:p>
     <w:sectPr>

</xml_diff>